<commit_message>
TP4 BDD ANGLAIS RAPPORT R101
</commit_message>
<xml_diff>
--- a/S1/R1.01 - Initiation au développement/TP/TP5/Rapport TP5.docx
+++ b/S1/R1.01 - Initiation au développement/TP/TP5/Rapport TP5.docx
@@ -672,6 +672,89 @@
             </a:graphic>
           </wp:inline>
         </w:drawing>
+      </w:r>
+    </w:p>
+    <w:p>
+      <w:pPr>
+        <w:spacing w:before="240" w:after="240"/>
+        <w:ind w:left="360"/>
+        <w:jc w:val="center"/>
+      </w:pPr>
+      <w:r>
+        <w:t>Avec un très grand nombre il nous renvoie les 4 premiers et ensuite les valeurs sont trop grandes pour être afficher instantanément car le suivant est proche de 33 millions.</w:t>
+      </w:r>
+    </w:p>
+    <w:p>
+      <w:pPr>
+        <w:spacing w:before="240" w:after="240"/>
+        <w:ind w:left="360"/>
+        <w:jc w:val="center"/>
+      </w:pPr>
+    </w:p>
+    <w:p>
+      <w:pPr>
+        <w:spacing w:before="240" w:after="240"/>
+        <w:ind w:left="360"/>
+        <w:jc w:val="center"/>
+      </w:pPr>
+    </w:p>
+    <w:p>
+      <w:pPr>
+        <w:spacing w:before="240" w:after="240"/>
+        <w:ind w:left="360"/>
+        <w:jc w:val="center"/>
+      </w:pPr>
+    </w:p>
+    <w:p>
+      <w:pPr>
+        <w:spacing w:before="240" w:after="240"/>
+        <w:ind w:left="360"/>
+        <w:jc w:val="center"/>
+      </w:pPr>
+    </w:p>
+    <w:p>
+      <w:pPr>
+        <w:spacing w:before="240" w:after="240"/>
+        <w:ind w:left="360"/>
+        <w:jc w:val="center"/>
+      </w:pPr>
+    </w:p>
+    <w:p>
+      <w:pPr>
+        <w:spacing w:before="240" w:after="240"/>
+        <w:ind w:left="360"/>
+        <w:jc w:val="center"/>
+      </w:pPr>
+    </w:p>
+    <w:p>
+      <w:pPr>
+        <w:spacing w:before="240" w:after="240"/>
+        <w:ind w:left="360"/>
+        <w:jc w:val="center"/>
+      </w:pPr>
+    </w:p>
+    <w:p>
+      <w:pPr>
+        <w:spacing w:before="240" w:after="240"/>
+        <w:ind w:left="360"/>
+        <w:jc w:val="center"/>
+      </w:pPr>
+    </w:p>
+    <w:p>
+      <w:pPr>
+        <w:spacing w:before="240" w:after="240"/>
+        <w:ind w:left="360"/>
+        <w:jc w:val="center"/>
+        <w:rPr>
+          <w:u w:val="single"/>
+        </w:rPr>
+      </w:pPr>
+      <w:r>
+        <w:rPr>
+          <w:u w:val="single"/>
+        </w:rPr>
+        <w:lastRenderedPageBreak/>
+        <w:t xml:space="preserve">EXERCICE 2 : </w:t>
       </w:r>
     </w:p>
     <w:p>

</xml_diff>